<commit_message>
v1.42.5 let the herb list collapse and give the ingredient picker a search box, because the query station runs out of horizontal space and 190 checkboxes cannot be scanned by eye
</commit_message>
<xml_diff>
--- a/Claude outputs/TCM_Platform_Progress_Report_2026-09-15_zh-Hans.docx
+++ b/Claude outputs/TCM_Platform_Progress_Report_2026-09-15_zh-Hans.docx
@@ -1244,7 +1244,7 @@
                 <w:sz w:val="19"/>
                 <w:szCs w:val="19"/>
               </w:rPr>
-              <w:t xml:space="preserve">把这些蛋白质关掉，癌细胞真的会活不下去吗？用国际细胞株数据库验证</w:t>
+              <w:t xml:space="preserve">把这些蛋白质关掉，癌细胞真的会活不下去吗？用国际细胞系数据库验证</w:t>
             </w:r>
           </w:p>
         </w:tc>
@@ -1491,7 +1491,7 @@
           <w:sz w:val="21"/>
           <w:szCs w:val="21"/>
         </w:rPr>
-        <w:t xml:space="preserve">品质落差非常大</w:t>
+        <w:t xml:space="preserve">质量落差非常大</w:t>
       </w:r>
       <w:r>
         <w:rPr>
@@ -2944,7 +2944,7 @@
                 <w:sz w:val="19"/>
                 <w:szCs w:val="19"/>
               </w:rPr>
-              <w:t xml:space="preserve">。它真正的价值是对品质、安全与研究方法提出国际标准</w:t>
+              <w:t xml:space="preserve">。它真正的价值是对质量、安全与研究方法提出国际标准</w:t>
             </w:r>
           </w:p>
         </w:tc>
@@ -3586,7 +3586,7 @@
                 <w:sz w:val="19"/>
                 <w:szCs w:val="19"/>
               </w:rPr>
-              <w:t xml:space="preserve">，还是得看研究设计、样本数、期刊品质与有没有被其他团队重复验证</w:t>
+              <w:t xml:space="preserve">，还是得看研究设计、样本数、期刊质量与有没有被其他团队重复验证</w:t>
             </w:r>
           </w:p>
         </w:tc>
@@ -4022,7 +4022,7 @@
                 <w:sz w:val="19"/>
                 <w:szCs w:val="19"/>
               </w:rPr>
-              <w:t xml:space="preserve">癌痛、疲倦、神经病变、睡眠、恶心、生活品质的随机试验</w:t>
+              <w:t xml:space="preserve">癌痛、疲倦、神经病变、睡眠、恶心、生活质量的随机试验</w:t>
             </w:r>
           </w:p>
         </w:tc>
@@ -4376,7 +4376,7 @@
                 <w:sz w:val="19"/>
                 <w:szCs w:val="19"/>
               </w:rPr>
-              <w:t xml:space="preserve">发布癌症防治行动方案、抗肿瘤药物指导原则与医疗品质要求，在中国中医药肿瘤政策上具有最高行政权威之一。</w:t>
+              <w:t xml:space="preserve">发布癌症防治行动方案、抗肿瘤药物指导原则与医疗质量要求，在中国中医药肿瘤政策上具有最高行政权威之一。</w:t>
             </w:r>
             <w:r>
               <w:rPr>
@@ -6036,7 +6036,7 @@
           <w:sz w:val="21"/>
           <w:szCs w:val="21"/>
         </w:rPr>
-        <w:t xml:space="preserve">平台用的是统计学上的「过度代表分析」，再加上多重检定校正。这里有三个设计决定，直接影响结果对不对：</w:t>
+        <w:t xml:space="preserve">平台用的是统计学上的「过度代表分析」，再加上多重检验校正。这里有三个设计决定，直接影响结果对不对：</w:t>
       </w:r>
     </w:p>
     <w:p>
@@ -6066,7 +6066,7 @@
           <w:sz w:val="21"/>
           <w:szCs w:val="21"/>
         </w:rPr>
-        <w:t xml:space="preserve"> 一次对好几千条通路做检定，</w:t>
+        <w:t xml:space="preserve"> 一次对好几千条通路做检验，</w:t>
       </w:r>
       <w:r>
         <w:rPr>
@@ -6076,7 +6076,7 @@
           <w:sz w:val="21"/>
           <w:szCs w:val="21"/>
         </w:rPr>
-        <w:t xml:space="preserve">就算数据全部是杂讯</w:t>
+        <w:t xml:space="preserve">就算数据全部是噪声</w:t>
       </w:r>
       <w:r>
         <w:rPr>
@@ -6086,7 +6086,7 @@
           <w:sz w:val="21"/>
           <w:szCs w:val="21"/>
         </w:rPr>
-        <w:t xml:space="preserve">，也会有一百多条「看起来显著」。这是几率问题，不是发现。不做校正等于在量产假发现，而这些结果是要写进研究报告的。</w:t>
+        <w:t xml:space="preserve">，也会有一百多条「看起来显著」。这是概率问题，不是发现。不做校正等于在量产假发现，而这些结果是要写进研究报告的。</w:t>
       </w:r>
     </w:p>
     <w:p>
@@ -7100,7 +7100,7 @@
           <w:sz w:val="21"/>
           <w:szCs w:val="21"/>
         </w:rPr>
-        <w:t xml:space="preserve">：这条凋亡假说后来在细胞株数据中独立获得支持，两个步骤用不同数据、不同方法，指向同一个方向。</w:t>
+        <w:t xml:space="preserve">：这条凋亡假说后来在细胞系数据中独立获得支持，两个步骤用不同数据、不同方法，指向同一个方向。</w:t>
       </w:r>
     </w:p>
     <w:p>
@@ -7859,7 +7859,7 @@
           <w:sz w:val="21"/>
           <w:szCs w:val="21"/>
         </w:rPr>
-        <w:t xml:space="preserve">。像「前列腺素合成酶 1」和「合成酶 2」是两个不同的基因，把尾数当成杂讯剥掉，两者就会互相污染。</w:t>
+        <w:t xml:space="preserve">。像「前列腺素合成酶 1」和「合成酶 2」是两个不同的基因，把尾数当成噪声剥掉，两者就会互相污染。</w:t>
       </w:r>
     </w:p>
     <w:p>
@@ -8345,7 +8345,7 @@
           <w:sz w:val="21"/>
           <w:szCs w:val="21"/>
         </w:rPr>
-        <w:t xml:space="preserve">这一步解锁了后面两站：通路分析的输入数据，就是这次顺手取得的那 1,258 笔对照；细胞株验证能跟国际数据库对上，靠的也是这次产出的标准代号。</w:t>
+        <w:t xml:space="preserve">这一步解锁了后面两站：通路分析的输入数据，就是这次顺手取得的那 1,258 笔对照；细胞系验证能跟国际数据库对上，靠的也是这次产出的标准代号。</w:t>
       </w:r>
       <w:r>
         <w:rPr>
@@ -8472,7 +8472,7 @@
           <w:sz w:val="21"/>
           <w:szCs w:val="21"/>
         </w:rPr>
-        <w:t xml:space="preserve">后果很实际：成分没有结构编码，就无法跟任何国际数据库比对，也做不了结构相似性分析。而那正是往第 5 站（细胞株验证）和第 6 站（研究报告）走的前提。</w:t>
+        <w:t xml:space="preserve">后果很实际：成分没有结构编码，就无法跟任何国际数据库比对，也做不了结构相似性分析。而那正是往第 5 站（细胞系验证）和第 6 站（研究报告）走的前提。</w:t>
       </w:r>
     </w:p>
     <w:p>
@@ -9427,7 +9427,7 @@
           <w:sz w:val="21"/>
           <w:szCs w:val="21"/>
         </w:rPr>
-        <w:t xml:space="preserve">待确认队列中有 81 笔对应到了错误的分子，其中 75 笔（93%）名称以 _qt 结尾。中药数据库用 _qt 表示「去掉糖基后的母核」，但名称清理进程把它当成杂讯剥除，导致查到的是带糖基的完整分子——两者是不同的化合物。这些数据目前仍在队列中，任何人清理队列都可能把它们按进数据库，而且进去之后不会有任何地方报错。处理顺序应高于提升覆盖率。</w:t>
+        <w:t xml:space="preserve">待确认队列中有 81 笔对应到了错误的分子，其中 75 笔（93%）名称以 _qt 结尾。中药数据库用 _qt 表示「去掉糖基后的母核」，但名称清理进程把它当成噪声剥除，导致查到的是带糖基的完整分子——两者是不同的化合物。这些数据目前仍在队列中，任何人清理队列都可能把它们按进数据库，而且进去之后不会有任何地方报错。处理顺序应高于提升覆盖率。</w:t>
       </w:r>
     </w:p>
     <w:p>
@@ -9522,7 +9522,7 @@
           <w:sz w:val="21"/>
           <w:szCs w:val="21"/>
         </w:rPr>
-        <w:t xml:space="preserve">留下来。后续所有分析——蛋白质对应、通路分析、细胞株验证——</w:t>
+        <w:t xml:space="preserve">留下来。后续所有分析——蛋白质对应、通路分析、细胞系验证——</w:t>
       </w:r>
       <w:r>
         <w:rPr>
@@ -13725,7 +13725,7 @@
           <w:sz w:val="21"/>
           <w:szCs w:val="21"/>
         </w:rPr>
-        <w:t xml:space="preserve">——没有出现「有结构但缺编号」这种半套情形。这代表这 17 种成分已经具备跨数据库比对的能力，可以进入后续的细胞株验证。</w:t>
+        <w:t xml:space="preserve">——没有出现「有结构但缺编号」这种半套情形。这代表这 17 种成分已经具备跨数据库比对的能力，可以进入后续的细胞系验证。</w:t>
       </w:r>
     </w:p>
     <w:p>
@@ -14289,7 +14289,7 @@
           <w:sz w:val="21"/>
           <w:szCs w:val="21"/>
         </w:rPr>
-        <w:t xml:space="preserve"> 中药数据库用 _qt 后缀表示「去掉糖基的母核」，但程序的名称清理步骤把它当成杂讯剥掉，结果查到的是带糖的完整分子。分子量差值刚好是葡萄糖单位的整数倍，</w:t>
+        <w:t xml:space="preserve"> 中药数据库用 _qt 后缀表示「去掉糖基的母核」，但程序的名称清理步骤把它当成噪声剥掉，结果查到的是带糖的完整分子。分子量差值刚好是葡萄糖单位的整数倍，</w:t>
       </w:r>
       <w:r>
         <w:rPr>
@@ -14931,7 +14931,7 @@
                 <w:sz w:val="19"/>
                 <w:szCs w:val="19"/>
               </w:rPr>
-              <w:t xml:space="preserve"> 这是第 5 站要把成分对到细胞株药物反应数据的先决条件</w:t>
+              <w:t xml:space="preserve"> 这是第 5 站要把成分对到细胞系药物反应数据的先决条件</w:t>
             </w:r>
           </w:p>
         </w:tc>
@@ -15213,7 +15213,7 @@
                 <w:sz w:val="19"/>
                 <w:szCs w:val="19"/>
               </w:rPr>
-              <w:t xml:space="preserve">的高品质内核数据（Swiss-Prot）约二十余万笔</w:t>
+              <w:t xml:space="preserve">的高质量内核数据（Swiss-Prot）约二十余万笔</w:t>
             </w:r>
           </w:p>
         </w:tc>
@@ -15267,7 +15267,7 @@
                 <w:sz w:val="19"/>
                 <w:szCs w:val="19"/>
               </w:rPr>
-              <w:t xml:space="preserve">每个蛋白质的标准名称、对应的基因代号与所有同义词、串行、功能注解、所属物种，以及与其他数据库的交叉引用</w:t>
+              <w:t xml:space="preserve">每个蛋白质的标准名称、对应的基因代号与所有同义词、序列、功能注解、所属物种，以及与其他数据库的交叉引用</w:t>
             </w:r>
           </w:p>
         </w:tc>
@@ -16425,7 +16425,7 @@
           <w:sz w:val="20"/>
           <w:szCs w:val="20"/>
         </w:rPr>
-        <w:t xml:space="preserve"> 由美国 Broad Institute（哈佛与麻省理工合设的研究所）营运，收录超过一千株癌症细胞株在基因被关闭后的存活变化。平台采用的是 24Q2 公开版，授权为 CC BY 4.0（可商用，但须标注出处与版本）。另一个同类数据库 GDSC 因授权条款禁止用于商业服务，</w:t>
+        <w:t xml:space="preserve"> 由美国 Broad Institute（哈佛与麻省理工合设的研究所）营运，收录超过一千株癌症细胞系在基因被关闭后的存活变化。平台采用的是 24Q2 公开版，授权为 CC BY 4.0（可商用，但须标注出处与版本）。另一个同类数据库 GDSC 因授权条款禁止用于商业服务，</w:t>
       </w:r>
       <w:r>
         <w:rPr>
@@ -16864,7 +16864,7 @@
                 <w:sz w:val="19"/>
                 <w:szCs w:val="19"/>
               </w:rPr>
-              <w:t xml:space="preserve">基因体 AI 工具集成</w:t>
+              <w:t xml:space="preserve">基因组 AI 工具集成</w:t>
             </w:r>
           </w:p>
         </w:tc>
@@ -17156,7 +17156,7 @@
           <w:sz w:val="21"/>
           <w:szCs w:val="21"/>
         </w:rPr>
-        <w:t xml:space="preserve">成分名称结尾的 _qt 是化学意义而不是杂讯，剥掉之后会</w:t>
+        <w:t xml:space="preserve">成分名称结尾的 _qt 是化学意义而不是噪声，剥掉之后会</w:t>
       </w:r>
       <w:r>
         <w:rPr>
@@ -17469,7 +17469,7 @@
                 <w:sz w:val="19"/>
                 <w:szCs w:val="19"/>
               </w:rPr>
-              <w:t xml:space="preserve">细胞株验证的画面</w:t>
+              <w:t xml:space="preserve">细胞系验证的画面</w:t>
             </w:r>
           </w:p>
         </w:tc>
@@ -17575,7 +17575,7 @@
                 <w:sz w:val="19"/>
                 <w:szCs w:val="19"/>
               </w:rPr>
-              <w:t xml:space="preserve">有一群基因同时出现在通路分析与细胞株验证两站，指向原始数据库的注记可能带有系统性偏差，会影响下游所有结论</w:t>
+              <w:t xml:space="preserve">有一群基因同时出现在通路分析与细胞系验证两站，指向原始数据库的注记可能带有系统性偏差，会影响下游所有结论</w:t>
             </w:r>
           </w:p>
         </w:tc>
@@ -18194,7 +18194,47 @@
                 <w:sz w:val="19"/>
                 <w:szCs w:val="19"/>
               </w:rPr>
-              <w:t xml:space="preserve">吃下去之后，真正进入血液循环的比例。平台采用学界常用的 30% 作为门槛，低于此值的成分即使有活性也难以在体内达到有效浓度。</w:t>
+              <w:t xml:space="preserve">吃下去之后，真正进入血液循环的比例。低于门槛的成分即使有活性，也难以在体内达到有效浓度。平台采用 </w:t>
+            </w:r>
+            <w:r>
+              <w:rPr>
+                <w:rFonts w:ascii="Microsoft JhengHei" w:cs="Microsoft JhengHei" w:eastAsia="Microsoft JhengHei" w:hAnsi="Microsoft JhengHei"/>
+                <w:b/>
+                <w:bCs/>
+                <w:sz w:val="19"/>
+                <w:szCs w:val="19"/>
+              </w:rPr>
+              <w:t xml:space="preserve">30%</w:t>
+            </w:r>
+            <w:r>
+              <w:rPr>
+                <w:rFonts w:ascii="Microsoft JhengHei" w:cs="Microsoft JhengHei" w:eastAsia="Microsoft JhengHei" w:hAnsi="Microsoft JhengHei"/>
+                <w:b w:val="false"/>
+                <w:bCs w:val="false"/>
+                <w:sz w:val="19"/>
+                <w:szCs w:val="19"/>
+              </w:rPr>
+              <w:t xml:space="preserve">，这是网络药理学文献的主流惯例，</w:t>
+            </w:r>
+            <w:r>
+              <w:rPr>
+                <w:rFonts w:ascii="Microsoft JhengHei" w:cs="Microsoft JhengHei" w:eastAsia="Microsoft JhengHei" w:hAnsi="Microsoft JhengHei"/>
+                <w:b/>
+                <w:bCs/>
+                <w:sz w:val="19"/>
+                <w:szCs w:val="19"/>
+              </w:rPr>
+              <w:t xml:space="preserve">但不是唯一说法</w:t>
+            </w:r>
+            <w:r>
+              <w:rPr>
+                <w:rFonts w:ascii="Microsoft JhengHei" w:cs="Microsoft JhengHei" w:eastAsia="Microsoft JhengHei" w:hAnsi="Microsoft JhengHei"/>
+                <w:b w:val="false"/>
+                <w:bCs w:val="false"/>
+                <w:sz w:val="19"/>
+                <w:szCs w:val="19"/>
+              </w:rPr>
+              <w:t xml:space="preserve">：TCMSP 原始论文的案例用 40%，官网参数页写 20%。引用时应注明采用哪一个。</w:t>
             </w:r>
           </w:p>
         </w:tc>
@@ -18289,7 +18329,87 @@
                 <w:sz w:val="19"/>
                 <w:szCs w:val="19"/>
               </w:rPr>
-              <w:t xml:space="preserve">衡量一个化合物在结构上「像不像一个药」的综合指针，依分子量、脂溶性等性质计算。平台采用 0.18 作为门槛，这是中药网络药理学的常用设置。</w:t>
+              <w:t xml:space="preserve">衡量一个分子「像不像一个药」。TCMSP 用 </w:t>
+            </w:r>
+            <w:r>
+              <w:rPr>
+                <w:rFonts w:ascii="Microsoft JhengHei" w:cs="Microsoft JhengHei" w:eastAsia="Microsoft JhengHei" w:hAnsi="Microsoft JhengHei"/>
+                <w:b/>
+                <w:bCs/>
+                <w:sz w:val="19"/>
+                <w:szCs w:val="19"/>
+              </w:rPr>
+              <w:t xml:space="preserve">Tanimoto 相似度</w:t>
+            </w:r>
+            <w:r>
+              <w:rPr>
+                <w:rFonts w:ascii="Microsoft JhengHei" w:cs="Microsoft JhengHei" w:eastAsia="Microsoft JhengHei" w:hAnsi="Microsoft JhengHei"/>
+                <w:b w:val="false"/>
+                <w:bCs w:val="false"/>
+                <w:sz w:val="19"/>
+                <w:szCs w:val="19"/>
+              </w:rPr>
+              <w:t xml:space="preserve">，把这个成分的分子性质矢量，跟 </w:t>
+            </w:r>
+            <w:r>
+              <w:rPr>
+                <w:rFonts w:ascii="Microsoft JhengHei" w:cs="Microsoft JhengHei" w:eastAsia="Microsoft JhengHei" w:hAnsi="Microsoft JhengHei"/>
+                <w:b/>
+                <w:bCs/>
+                <w:sz w:val="19"/>
+                <w:szCs w:val="19"/>
+              </w:rPr>
+              <w:t xml:space="preserve">DrugBank 全部药物的平均性质</w:t>
+            </w:r>
+            <w:r>
+              <w:rPr>
+                <w:rFonts w:ascii="Microsoft JhengHei" w:cs="Microsoft JhengHei" w:eastAsia="Microsoft JhengHei" w:hAnsi="Microsoft JhengHei"/>
+                <w:b w:val="false"/>
+                <w:bCs w:val="false"/>
+                <w:sz w:val="19"/>
+                <w:szCs w:val="19"/>
+              </w:rPr>
+              <w:t xml:space="preserve">相比，值域 0～1。</w:t>
+            </w:r>
+            <w:r>
+              <w:rPr>
+                <w:rFonts w:ascii="Microsoft JhengHei" w:cs="Microsoft JhengHei" w:eastAsia="Microsoft JhengHei" w:hAnsi="Microsoft JhengHei"/>
+                <w:b/>
+                <w:bCs/>
+                <w:sz w:val="19"/>
+                <w:szCs w:val="19"/>
+              </w:rPr>
+              <w:t xml:space="preserve">0.18 就是 DrugBank 自己的平均值</w:t>
+            </w:r>
+            <w:r>
+              <w:rPr>
+                <w:rFonts w:ascii="Microsoft JhengHei" w:cs="Microsoft JhengHei" w:eastAsia="Microsoft JhengHei" w:hAnsi="Microsoft JhengHei"/>
+                <w:b w:val="false"/>
+                <w:bCs w:val="false"/>
+                <w:sz w:val="19"/>
+                <w:szCs w:val="19"/>
+              </w:rPr>
+              <w:t xml:space="preserve">，所以「DL ≥ 0.18」等于说「至少跟一般已知药物一样像药」。它是分布的中间点，</w:t>
+            </w:r>
+            <w:r>
+              <w:rPr>
+                <w:rFonts w:ascii="Microsoft JhengHei" w:cs="Microsoft JhengHei" w:eastAsia="Microsoft JhengHei" w:hAnsi="Microsoft JhengHei"/>
+                <w:b/>
+                <w:bCs/>
+                <w:sz w:val="19"/>
+                <w:szCs w:val="19"/>
+              </w:rPr>
+              <w:t xml:space="preserve">不是概率</w:t>
+            </w:r>
+            <w:r>
+              <w:rPr>
+                <w:rFonts w:ascii="Microsoft JhengHei" w:cs="Microsoft JhengHei" w:eastAsia="Microsoft JhengHei" w:hAnsi="Microsoft JhengHei"/>
+                <w:b w:val="false"/>
+                <w:bCs w:val="false"/>
+                <w:sz w:val="19"/>
+                <w:szCs w:val="19"/>
+              </w:rPr>
+              <w:t xml:space="preserve">。</w:t>
             </w:r>
           </w:p>
         </w:tc>
@@ -18505,6 +18625,98 @@
         </w:tc>
       </w:tr>
     </w:tbl>
+    <w:p>
+      <w:pPr>
+        <w:spacing w:after="140"/>
+      </w:pPr>
+    </w:p>
+    <w:p>
+      <w:pPr>
+        <w:pBdr>
+          <w:left w:val="single" w:color="7FA0C8" w:sz="18" w:space="6"/>
+        </w:pBdr>
+        <w:shd w:fill="F1F5FA" w:val="clear"/>
+        <w:spacing w:after="150" w:before="110" w:line="320"/>
+        <w:ind w:left="180"/>
+      </w:pPr>
+      <w:r>
+        <w:rPr>
+          <w:rFonts w:ascii="Microsoft JhengHei" w:cs="Microsoft JhengHei" w:eastAsia="Microsoft JhengHei" w:hAnsi="Microsoft JhengHei"/>
+          <w:b/>
+          <w:bCs/>
+          <w:sz w:val="20"/>
+          <w:szCs w:val="20"/>
+        </w:rPr>
+        <w:t xml:space="preserve">这两个门槛的地位不一样，对外引用时要分清楚。</w:t>
+      </w:r>
+      <w:r>
+        <w:rPr>
+          <w:rFonts w:ascii="Microsoft JhengHei" w:cs="Microsoft JhengHei" w:eastAsia="Microsoft JhengHei" w:hAnsi="Microsoft JhengHei"/>
+          <w:b w:val="false"/>
+          <w:bCs w:val="false"/>
+          <w:sz w:val="20"/>
+          <w:szCs w:val="20"/>
+        </w:rPr>
+        <w:t xml:space="preserve"> DL 的 0.18 有明确定义可以辩护——它就是 DrugBank 全部药物的平均类药性指数，所有相关文献都用同一个值。OB 的 30% 则是</w:t>
+      </w:r>
+      <w:r>
+        <w:rPr>
+          <w:rFonts w:ascii="Microsoft JhengHei" w:cs="Microsoft JhengHei" w:eastAsia="Microsoft JhengHei" w:hAnsi="Microsoft JhengHei"/>
+          <w:b/>
+          <w:bCs/>
+          <w:sz w:val="20"/>
+          <w:szCs w:val="20"/>
+        </w:rPr>
+        <w:t xml:space="preserve">惯例选择</w:t>
+      </w:r>
+      <w:r>
+        <w:rPr>
+          <w:rFonts w:ascii="Microsoft JhengHei" w:cs="Microsoft JhengHei" w:eastAsia="Microsoft JhengHei" w:hAnsi="Microsoft JhengHei"/>
+          <w:b w:val="false"/>
+          <w:bCs w:val="false"/>
+          <w:sz w:val="20"/>
+          <w:szCs w:val="20"/>
+        </w:rPr>
+        <w:t xml:space="preserve">：TCMSP 原始论文的甘草案例用 40%，TCMSP 官网的参数说明页写 20%，网络药理学文献主流用 30%。三种都有人用，本平台采用 30%。被问到时要答得出来「为什么是 30% 不是 40%」。</w:t>
+      </w:r>
+    </w:p>
+    <w:p>
+      <w:pPr>
+        <w:spacing w:after="140"/>
+      </w:pPr>
+    </w:p>
+    <w:p>
+      <w:pPr>
+        <w:pBdr>
+          <w:left w:val="single" w:color="C00000" w:sz="18" w:space="6"/>
+        </w:pBdr>
+        <w:shd w:fill="FDF0F0" w:val="clear"/>
+        <w:spacing w:after="150" w:before="110" w:line="320"/>
+        <w:ind w:left="180"/>
+      </w:pPr>
+      <w:r>
+        <w:rPr>
+          <w:rFonts w:ascii="Microsoft JhengHei" w:cs="Microsoft JhengHei" w:eastAsia="Microsoft JhengHei" w:hAnsi="Microsoft JhengHei"/>
+          <w:b/>
+          <w:bCs/>
+          <w:color w:val="C00000"/>
+          <w:sz w:val="21"/>
+          <w:szCs w:val="21"/>
+        </w:rPr>
+        <w:t xml:space="preserve">DL 高不等于有效。</w:t>
+      </w:r>
+      <w:r>
+        <w:rPr>
+          <w:rFonts w:ascii="Microsoft JhengHei" w:cs="Microsoft JhengHei" w:eastAsia="Microsoft JhengHei" w:hAnsi="Microsoft JhengHei"/>
+          <w:b/>
+          <w:bCs/>
+          <w:color w:val="C00000"/>
+          <w:sz w:val="21"/>
+          <w:szCs w:val="21"/>
+        </w:rPr>
+        <w:t xml:space="preserve"> 它只说这个分子「化学长相像已知的药」，既不代表有生物活性，更不代表对任何疾病有效。而且这把尺对天然物天生不利：皂苷、糖苷这类带多个糖基的大分子，跟 DrugBank 以小分子合成药为主的平均值差很远——人参皂苷被这道门槛刷掉，是因为这把尺不是为它们设计的，不是因为它们没有价值。</w:t>
+      </w:r>
+    </w:p>
     <w:p>
       <w:pPr>
         <w:spacing w:after="140"/>
@@ -19645,7 +19857,7 @@
                 <w:sz w:val="19"/>
                 <w:szCs w:val="19"/>
               </w:rPr>
-              <w:t xml:space="preserve">京都基因与基因体百科全书</w:t>
+              <w:t xml:space="preserve">京都基因与基因组百科全书</w:t>
             </w:r>
           </w:p>
         </w:tc>
@@ -19930,7 +20142,7 @@
                 <w:sz w:val="19"/>
                 <w:szCs w:val="19"/>
               </w:rPr>
-              <w:t xml:space="preserve">超几何检定</w:t>
+              <w:t xml:space="preserve">超几何检验</w:t>
             </w:r>
           </w:p>
         </w:tc>
@@ -19982,7 +20194,7 @@
                 <w:sz w:val="19"/>
                 <w:szCs w:val="19"/>
               </w:rPr>
-              <w:t xml:space="preserve">富集分析使用的几率计算方法。概念类似「从一袋混色球中抓一把，抓到这么多红球的几率有多低」，用来判断观察到的集中现象是不是巧合。</w:t>
+              <w:t xml:space="preserve">富集分析使用的概率计算方法。概念类似「从一袋混色球中抓一把，抓到这么多红球的概率有多低」，用来判断观察到的集中现象是不是巧合。</w:t>
             </w:r>
           </w:p>
         </w:tc>
@@ -20092,7 +20304,7 @@
                 <w:sz w:val="19"/>
                 <w:szCs w:val="19"/>
               </w:rPr>
-              <w:t xml:space="preserve">一次做上千次检定时，纯靠运气也会出现很多「显著」结果。FDR 校正就是用来扣掉这些运气成分，校正后的数值称为 q 值。</w:t>
+              <w:t xml:space="preserve">一次做上千次检验时，纯靠运气也会出现很多「显著」结果。FDR 校正就是用来扣掉这些运气成分，校正后的数值称为 q 值。</w:t>
             </w:r>
             <w:r>
               <w:rPr>
@@ -20544,7 +20756,7 @@
                 <w:sz w:val="19"/>
                 <w:szCs w:val="19"/>
               </w:rPr>
-              <w:t xml:space="preserve">临床基因体资源／基因套组平台</w:t>
+              <w:t xml:space="preserve">临床基因组资源／基因套组平台</w:t>
             </w:r>
           </w:p>
         </w:tc>
@@ -20626,7 +20838,7 @@
                 <w:sz w:val="19"/>
                 <w:szCs w:val="19"/>
               </w:rPr>
-              <w:t xml:space="preserve">GenCC 的两个主要数据提供者。前者由美国国家卫生研究院资助，后者由英国基因体学公司维护，两者都是基因–疾病关联判定的国际权威审查小组。</w:t>
+              <w:t xml:space="preserve">GenCC 的两个主要数据提供者。前者由美国国家卫生研究院资助，后者由英国基因组学公司维护，两者都是基因–疾病关联判定的国际权威审查小组。</w:t>
             </w:r>
           </w:p>
         </w:tc>
@@ -20851,7 +21063,7 @@
           <w:sz w:val="23"/>
           <w:szCs w:val="23"/>
         </w:rPr>
-        <w:t xml:space="preserve">细胞株与验证</w:t>
+        <w:t xml:space="preserve">细胞系与验证</w:t>
       </w:r>
     </w:p>
     <w:tbl>
@@ -21078,7 +21290,7 @@
                 <w:sz w:val="19"/>
                 <w:szCs w:val="19"/>
               </w:rPr>
-              <w:t xml:space="preserve">细胞株</w:t>
+              <w:t xml:space="preserve">细胞系</w:t>
             </w:r>
           </w:p>
         </w:tc>
@@ -21130,7 +21342,7 @@
                 <w:sz w:val="19"/>
                 <w:szCs w:val="19"/>
               </w:rPr>
-              <w:t xml:space="preserve">从肿瘤取出、能在实验室中长期培养繁殖的癌细胞。不同细胞株来自不同癌别与不同病人，是药物筛选最常用的实验材料。</w:t>
+              <w:t xml:space="preserve">从肿瘤取出、能在实验室中长期培养繁殖的癌细胞。不同细胞系来自不同癌别与不同病人，是药物筛选最常用的实验材料。</w:t>
             </w:r>
           </w:p>
         </w:tc>
@@ -21158,7 +21370,7 @@
                 <w:sz w:val="19"/>
                 <w:szCs w:val="19"/>
               </w:rPr>
-              <w:t xml:space="preserve">癌症细胞株百科／药物敏感性数据库</w:t>
+              <w:t xml:space="preserve">癌症细胞系百科／药物敏感性数据库</w:t>
             </w:r>
           </w:p>
         </w:tc>
@@ -21255,7 +21467,7 @@
                 <w:sz w:val="19"/>
                 <w:szCs w:val="19"/>
               </w:rPr>
-              <w:t xml:space="preserve">另外两个癌症细胞株数据库，分别记录细胞株的基因体特征与对各种药物的敏感性。</w:t>
+              <w:t xml:space="preserve">另外两个癌症细胞系数据库，分别记录细胞系的基因组特征与对各种药物的敏感性。</w:t>
             </w:r>
             <w:r>
               <w:rPr>

</xml_diff>